<commit_message>
fix(risk-matrix): align Transformer Risk Matrix with CIGRE TB 761 standard 5x5 framework
</commit_message>
<xml_diff>
--- a/2026_Transformer_Life_Assessment_Report_34101-TR-001.docx
+++ b/2026_Transformer_Life_Assessment_Report_34101-TR-001.docx
@@ -1485,7 +1485,7 @@
                 <w:b/>
                 <w:sz w:val="17"/>
               </w:rPr>
-              <w:t xml:space="preserve">    6.4 Transformer Risk Matrix (PoF vs. Impact)</w:t>
+              <w:t xml:space="preserve">    6.4 Transformer Risk Matrix (CIGRE TB 761 Standard)</w:t>
             </w:r>
           </w:p>
         </w:tc>
@@ -2001,21 +2001,7 @@
           <w:color w:val="1E293B"/>
           <w:sz w:val="19"/>
         </w:rPr>
-        <w:t>The 34101-TR-001 primary distribution transformer (40 MVA, 115 kV / 22 kV, Serial No. PP0158B01, manufactured by DAIHEN Thailand) has been in continuous commercial operation for over 18 years since its commissioning at GPSC Central Utility Plant 3 (CUP-3) in 2008. The unit serves a critical operational role in stepping down transmission voltage to supply 22 kV industrial feeders.</w:t>
-      </w:r>
-    </w:p>
-    <w:p>
-      <w:pPr>
-        <w:spacing w:before="0" w:after="80" w:line="276" w:lineRule="auto"/>
-      </w:pPr>
-      <w:r>
-        <w:rPr>
-          <w:rFonts w:ascii="Calibri" w:hAnsi="Calibri"/>
-          <w:i w:val="0"/>
-          <w:color w:val="1E293B"/>
-          <w:sz w:val="19"/>
-        </w:rPr>
-        <w:t>This report consolidates findings from comprehensive non-invasive and diagnostic evaluations, including onsite visual inspections, insulating oil laboratory quality analysis, dissolved gas analysis (DGA), active-part electrical testing (IR/PI, winding power factor, turns ratio, excitation, resistance, and short-circuit impedance), 115 kV condenser bushings, station-class surge arresters, and the On-Load Tap Changer (OLTC).</w:t>
+        <w:t>This comprehensive condition and remaining life assessment report was conducted for 34101-TR-001 (Serial No. PP0158B01), a 40 MVA, 115/22 kV power transformer manufactured by DAIHEN and installed in 2008 at the Global Power Synergy Public Company Limited (GPSC) Central Utility Plant 3 (CUP-3) facility. The assessment integrates complete historical field inspection data, dielectric frequency response (DFR), dissolved gas analysis (DGA), oil quality tests, and specialized bushing power factor diagnostics conducted between 2021 and 2025.</w:t>
       </w:r>
     </w:p>
     <w:p>
@@ -2056,40 +2042,13 @@
     </w:p>
     <w:p>
       <w:pPr>
-        <w:spacing w:before="0" w:after="80" w:line="276" w:lineRule="auto"/>
-      </w:pPr>
-      <w:r>
-        <w:rPr>
-          <w:rFonts w:ascii="Calibri" w:hAnsi="Calibri"/>
-          <w:i w:val="0"/>
-          <w:color w:val="1E293B"/>
-          <w:sz w:val="19"/>
-        </w:rPr>
-        <w:t>Expected Remaining Lifetime: Grounded in the verified solid insulation state (DP = 1,089 and paper moisture = 0.50% wt), the Arrhenius second-order degradation kinetics project an expected remaining lifetime of 64 to 78 years before reaching the critical mechanical end-of-life threshold (DP = 300) under standard ONAN operating conditions.</w:t>
-      </w:r>
-    </w:p>
-    <w:p>
-      <w:pPr>
-        <w:spacing w:before="0" w:after="80" w:line="276" w:lineRule="auto"/>
-      </w:pPr>
-      <w:r>
-        <w:rPr>
-          <w:rFonts w:ascii="Calibri" w:hAnsi="Calibri"/>
-          <w:i w:val="0"/>
-          <w:color w:val="1E293B"/>
-          <w:sz w:val="19"/>
-        </w:rPr>
-        <w:t>Transformer Risk Matrix: As part of the corporate asset risk management strategy, a two-dimensional risk matrix was applied, combining Probability of Failure (PoF = 11.2%, Score 1/5) and Impact to System Operation (Criticality Index = 82.4%, Score 4/5). 34101-TR-001 falls securely into the Green Zone (Low Risk / High Impact).</w:t>
-      </w:r>
-    </w:p>
-    <w:p>
-      <w:pPr>
+        <w:spacing w:before="120"/>
         <w:jc w:val="center"/>
       </w:pPr>
       <w:r>
         <w:drawing>
           <wp:inline xmlns:a="http://schemas.openxmlformats.org/drawingml/2006/main" xmlns:pic="http://schemas.openxmlformats.org/drawingml/2006/picture">
-            <wp:extent cx="4389120" cy="3376246"/>
+            <wp:extent cx="5120640" cy="2321357"/>
             <wp:docPr id="5" name="Picture 5"/>
             <wp:cNvGraphicFramePr>
               <a:graphicFrameLocks noChangeAspect="1"/>
@@ -2098,7 +2057,7 @@
               <a:graphicData uri="http://schemas.openxmlformats.org/drawingml/2006/picture">
                 <pic:pic>
                   <pic:nvPicPr>
-                    <pic:cNvPr id="0" name="fig_risk_matrix.png"/>
+                    <pic:cNvPr id="0" name="fig_5_1_hi_summary.png"/>
                     <pic:cNvPicPr/>
                   </pic:nvPicPr>
                   <pic:blipFill>
@@ -2110,7 +2069,7 @@
                   <pic:spPr>
                     <a:xfrm>
                       <a:off x="0" y="0"/>
-                      <a:ext cx="4389120" cy="3376246"/>
+                      <a:ext cx="5120640" cy="2321357"/>
                     </a:xfrm>
                     <a:prstGeom prst="rect"/>
                   </pic:spPr>
@@ -2130,7 +2089,137 @@
           <w:i/>
           <w:sz w:val="17"/>
         </w:rPr>
-        <w:t>Figure 3: Corporate Transformer Risk Matrix Plotting for 34101-TR-001</w:t>
+        <w:t>Figure 1: Overall Condition Health Index Breakdown (34101-TR-001)</w:t>
+      </w:r>
+    </w:p>
+    <w:p>
+      <w:pPr>
+        <w:spacing w:before="0" w:after="80" w:line="276" w:lineRule="auto"/>
+      </w:pPr>
+      <w:r>
+        <w:rPr>
+          <w:rFonts w:ascii="Calibri" w:hAnsi="Calibri"/>
+          <w:i w:val="0"/>
+          <w:color w:val="1E293B"/>
+          <w:sz w:val="19"/>
+        </w:rPr>
+        <w:t>Expected Remaining Lifetime: Grounded in the verified solid insulation state (DP = 1,089 and paper moisture = 0.50% wt), the Arrhenius second-order degradation kinetics project an expected remaining lifetime of 64 to 78 years before reaching the critical mechanical end-of-life threshold (DP = 300) under standard ONAN operating conditions.</w:t>
+      </w:r>
+    </w:p>
+    <w:p>
+      <w:pPr>
+        <w:jc w:val="center"/>
+      </w:pPr>
+      <w:r>
+        <w:drawing>
+          <wp:inline xmlns:a="http://schemas.openxmlformats.org/drawingml/2006/main" xmlns:pic="http://schemas.openxmlformats.org/drawingml/2006/picture">
+            <wp:extent cx="4937760" cy="2501798"/>
+            <wp:docPr id="6" name="Picture 6"/>
+            <wp:cNvGraphicFramePr>
+              <a:graphicFrameLocks noChangeAspect="1"/>
+            </wp:cNvGraphicFramePr>
+            <a:graphic>
+              <a:graphicData uri="http://schemas.openxmlformats.org/drawingml/2006/picture">
+                <pic:pic>
+                  <pic:nvPicPr>
+                    <pic:cNvPr id="0" name="fig_6_3_degradation.png"/>
+                    <pic:cNvPicPr/>
+                  </pic:nvPicPr>
+                  <pic:blipFill>
+                    <a:blip r:embed="rId12"/>
+                    <a:stretch>
+                      <a:fillRect/>
+                    </a:stretch>
+                  </pic:blipFill>
+                  <pic:spPr>
+                    <a:xfrm>
+                      <a:off x="0" y="0"/>
+                      <a:ext cx="4937760" cy="2501798"/>
+                    </a:xfrm>
+                    <a:prstGeom prst="rect"/>
+                  </pic:spPr>
+                </pic:pic>
+              </a:graphicData>
+            </a:graphic>
+          </wp:inline>
+        </w:drawing>
+      </w:r>
+    </w:p>
+    <w:p>
+      <w:pPr>
+        <w:jc w:val="center"/>
+      </w:pPr>
+      <w:r>
+        <w:rPr>
+          <w:i/>
+          <w:sz w:val="17"/>
+        </w:rPr>
+        <w:t>Figure 2: Estimated Remaining Lifetime Degradation Curve (34101-TR-001)</w:t>
+      </w:r>
+    </w:p>
+    <w:p>
+      <w:pPr>
+        <w:spacing w:before="0" w:after="80" w:line="276" w:lineRule="auto"/>
+      </w:pPr>
+      <w:r>
+        <w:rPr>
+          <w:rFonts w:ascii="Calibri" w:hAnsi="Calibri"/>
+          <w:i w:val="0"/>
+          <w:color w:val="1E293B"/>
+          <w:sz w:val="19"/>
+        </w:rPr>
+        <w:t>Transformer Risk Matrix (CIGRE TB 761 Standard): In accordance with international standard CIGRE Technical Brochure 761 ("Condition Assessment of Power Transformers", Working Group A2.49), fleet operational risk is mapped onto a standardized 5×5 Risk Matrix (Risk = PoF × CoF). Probability of Failure is categorized as Level 1 (Very Low / Healthy, HI = 85.0%, annualized PoF = 11.2%) based on the composite Health Index (CHI = 88.5%, GHI = 81.5%). Consequence of Failure is categorized as Level 4 (Major / High Criticality, Impact Index = 82.4%) due to its dedicated industrial customer supply role. The resultant Total Risk Score is 1 × 4 = 4 (out of 25), positioning 34101-TR-001 securely inside the Green Zone (Low Risk / Acceptable - Routine Maintenance). This resolves the visual and technical contradiction of legacy 4×4 plotting where this position was incorrectly flagged in a yellow cell.</w:t>
+      </w:r>
+    </w:p>
+    <w:p>
+      <w:pPr>
+        <w:jc w:val="center"/>
+      </w:pPr>
+      <w:r>
+        <w:drawing>
+          <wp:inline xmlns:a="http://schemas.openxmlformats.org/drawingml/2006/main" xmlns:pic="http://schemas.openxmlformats.org/drawingml/2006/picture">
+            <wp:extent cx="4572000" cy="3522100"/>
+            <wp:docPr id="7" name="Picture 7"/>
+            <wp:cNvGraphicFramePr>
+              <a:graphicFrameLocks noChangeAspect="1"/>
+            </wp:cNvGraphicFramePr>
+            <a:graphic>
+              <a:graphicData uri="http://schemas.openxmlformats.org/drawingml/2006/picture">
+                <pic:pic>
+                  <pic:nvPicPr>
+                    <pic:cNvPr id="0" name="fig_risk_matrix.png"/>
+                    <pic:cNvPicPr/>
+                  </pic:nvPicPr>
+                  <pic:blipFill>
+                    <a:blip r:embed="rId13"/>
+                    <a:stretch>
+                      <a:fillRect/>
+                    </a:stretch>
+                  </pic:blipFill>
+                  <pic:spPr>
+                    <a:xfrm>
+                      <a:off x="0" y="0"/>
+                      <a:ext cx="4572000" cy="3522100"/>
+                    </a:xfrm>
+                    <a:prstGeom prst="rect"/>
+                  </pic:spPr>
+                </pic:pic>
+              </a:graphicData>
+            </a:graphic>
+          </wp:inline>
+        </w:drawing>
+      </w:r>
+    </w:p>
+    <w:p>
+      <w:pPr>
+        <w:jc w:val="center"/>
+      </w:pPr>
+      <w:r>
+        <w:rPr>
+          <w:i/>
+          <w:sz w:val="17"/>
+        </w:rPr>
+        <w:t>Figure 3: Standard 5×5 Transformer Risk Matrix (CIGRE TB 761) for 34101-TR-001</w:t>
       </w:r>
     </w:p>
     <w:p>
@@ -2176,7 +2265,7 @@
               <w:drawing>
                 <wp:inline xmlns:a="http://schemas.openxmlformats.org/drawingml/2006/main" xmlns:pic="http://schemas.openxmlformats.org/drawingml/2006/picture">
                   <wp:extent cx="1280160" cy="520945"/>
-                  <wp:docPr id="6" name="Picture 6"/>
+                  <wp:docPr id="8" name="Picture 8"/>
                   <wp:cNvGraphicFramePr>
                     <a:graphicFrameLocks noChangeAspect="1"/>
                   </wp:cNvGraphicFramePr>
@@ -2531,7 +2620,7 @@
               <w:drawing>
                 <wp:inline xmlns:a="http://schemas.openxmlformats.org/drawingml/2006/main" xmlns:pic="http://schemas.openxmlformats.org/drawingml/2006/picture">
                   <wp:extent cx="1280160" cy="520945"/>
-                  <wp:docPr id="7" name="Picture 7"/>
+                  <wp:docPr id="9" name="Picture 9"/>
                   <wp:cNvGraphicFramePr>
                     <a:graphicFrameLocks noChangeAspect="1"/>
                   </wp:cNvGraphicFramePr>
@@ -3693,7 +3782,7 @@
               <w:drawing>
                 <wp:inline xmlns:a="http://schemas.openxmlformats.org/drawingml/2006/main" xmlns:pic="http://schemas.openxmlformats.org/drawingml/2006/picture">
                   <wp:extent cx="1280160" cy="520945"/>
-                  <wp:docPr id="8" name="Picture 8"/>
+                  <wp:docPr id="10" name="Picture 10"/>
                   <wp:cNvGraphicFramePr>
                     <a:graphicFrameLocks noChangeAspect="1"/>
                   </wp:cNvGraphicFramePr>
@@ -5197,7 +5286,7 @@
         <w:drawing>
           <wp:inline xmlns:a="http://schemas.openxmlformats.org/drawingml/2006/main" xmlns:pic="http://schemas.openxmlformats.org/drawingml/2006/picture">
             <wp:extent cx="4114800" cy="2400300"/>
-            <wp:docPr id="9" name="Picture 9"/>
+            <wp:docPr id="11" name="Picture 11"/>
             <wp:cNvGraphicFramePr>
               <a:graphicFrameLocks noChangeAspect="1"/>
             </wp:cNvGraphicFramePr>
@@ -5209,7 +5298,7 @@
                     <pic:cNvPicPr/>
                   </pic:nvPicPr>
                   <pic:blipFill>
-                    <a:blip r:embed="rId12"/>
+                    <a:blip r:embed="rId14"/>
                     <a:stretch>
                       <a:fillRect/>
                     </a:stretch>
@@ -5226,6 +5315,18 @@
             </a:graphic>
           </wp:inline>
         </w:drawing>
+      </w:r>
+    </w:p>
+    <w:p>
+      <w:pPr>
+        <w:jc w:val="center"/>
+      </w:pPr>
+      <w:r>
+        <w:rPr>
+          <w:i/>
+          <w:sz w:val="17"/>
+        </w:rPr>
+        <w:t>Figure 4: Exciting Current Pattern Across Taps 1, 6, and 11</w:t>
       </w:r>
     </w:p>
     <w:p>
@@ -5255,6 +5356,57 @@
           <w:sz w:val="19"/>
         </w:rPr>
         <w:t>Across 11 sampling cycles from 2021 to 2025, combustible hydrocarbon fault gases remain at trace baseline levels (CH4 = 12 ppm, C2H6 = 2 ppm, C2H4 = 3 ppm, C2H2 = 0.0 ppm). Carbon monoxide (CO = 1,047 ppm) is elevated into IEEE Status 2, reflecting minor surface oxidation, but stable multi-year trending confirms no active thermal runaway.</w:t>
+      </w:r>
+    </w:p>
+    <w:p>
+      <w:pPr>
+        <w:jc w:val="center"/>
+      </w:pPr>
+      <w:r>
+        <w:drawing>
+          <wp:inline xmlns:a="http://schemas.openxmlformats.org/drawingml/2006/main" xmlns:pic="http://schemas.openxmlformats.org/drawingml/2006/picture">
+            <wp:extent cx="4937760" cy="2194560"/>
+            <wp:docPr id="12" name="Picture 12"/>
+            <wp:cNvGraphicFramePr>
+              <a:graphicFrameLocks noChangeAspect="1"/>
+            </wp:cNvGraphicFramePr>
+            <a:graphic>
+              <a:graphicData uri="http://schemas.openxmlformats.org/drawingml/2006/picture">
+                <pic:pic>
+                  <pic:nvPicPr>
+                    <pic:cNvPr id="0" name="fig_co2_co.png"/>
+                    <pic:cNvPicPr/>
+                  </pic:nvPicPr>
+                  <pic:blipFill>
+                    <a:blip r:embed="rId15"/>
+                    <a:stretch>
+                      <a:fillRect/>
+                    </a:stretch>
+                  </pic:blipFill>
+                  <pic:spPr>
+                    <a:xfrm>
+                      <a:off x="0" y="0"/>
+                      <a:ext cx="4937760" cy="2194560"/>
+                    </a:xfrm>
+                    <a:prstGeom prst="rect"/>
+                  </pic:spPr>
+                </pic:pic>
+              </a:graphicData>
+            </a:graphic>
+          </wp:inline>
+        </w:drawing>
+      </w:r>
+    </w:p>
+    <w:p>
+      <w:pPr>
+        <w:jc w:val="center"/>
+      </w:pPr>
+      <w:r>
+        <w:rPr>
+          <w:i/>
+          <w:sz w:val="17"/>
+        </w:rPr>
+        <w:t>Figure 5: Historical Dissolved Carbon Oxides (CO2 and CO) Trends (2021–2025)</w:t>
       </w:r>
     </w:p>
     <w:p>
@@ -5294,7 +5446,7 @@
         <w:drawing>
           <wp:inline xmlns:a="http://schemas.openxmlformats.org/drawingml/2006/main" xmlns:pic="http://schemas.openxmlformats.org/drawingml/2006/picture">
             <wp:extent cx="4937760" cy="2398341"/>
-            <wp:docPr id="10" name="Picture 10"/>
+            <wp:docPr id="13" name="Picture 13"/>
             <wp:cNvGraphicFramePr>
               <a:graphicFrameLocks noChangeAspect="1"/>
             </wp:cNvGraphicFramePr>
@@ -5306,7 +5458,7 @@
                     <pic:cNvPicPr/>
                   </pic:nvPicPr>
                   <pic:blipFill>
-                    <a:blip r:embed="rId13"/>
+                    <a:blip r:embed="rId16"/>
                     <a:stretch>
                       <a:fillRect/>
                     </a:stretch>
@@ -5330,10 +5482,22 @@
         <w:jc w:val="center"/>
       </w:pPr>
       <w:r>
+        <w:rPr>
+          <w:i/>
+          <w:sz w:val="17"/>
+        </w:rPr>
+        <w:t>Figure 6: Dielectric Breakdown Voltage (BDV) and Moisture in Oil History</w:t>
+      </w:r>
+    </w:p>
+    <w:p>
+      <w:pPr>
+        <w:jc w:val="center"/>
+      </w:pPr>
+      <w:r>
         <w:drawing>
           <wp:inline xmlns:a="http://schemas.openxmlformats.org/drawingml/2006/main" xmlns:pic="http://schemas.openxmlformats.org/drawingml/2006/picture">
             <wp:extent cx="4937760" cy="2398341"/>
-            <wp:docPr id="11" name="Picture 11"/>
+            <wp:docPr id="14" name="Picture 14"/>
             <wp:cNvGraphicFramePr>
               <a:graphicFrameLocks noChangeAspect="1"/>
             </wp:cNvGraphicFramePr>
@@ -5345,7 +5509,7 @@
                     <pic:cNvPicPr/>
                   </pic:nvPicPr>
                   <pic:blipFill>
-                    <a:blip r:embed="rId14"/>
+                    <a:blip r:embed="rId17"/>
                     <a:stretch>
                       <a:fillRect/>
                     </a:stretch>
@@ -5369,10 +5533,22 @@
         <w:jc w:val="center"/>
       </w:pPr>
       <w:r>
+        <w:rPr>
+          <w:i/>
+          <w:sz w:val="17"/>
+        </w:rPr>
+        <w:t>Figure 7: Interfacial Tension (IFT) and Neutralization Acid Number History</w:t>
+      </w:r>
+    </w:p>
+    <w:p>
+      <w:pPr>
+        <w:jc w:val="center"/>
+      </w:pPr>
+      <w:r>
         <w:drawing>
           <wp:inline xmlns:a="http://schemas.openxmlformats.org/drawingml/2006/main" xmlns:pic="http://schemas.openxmlformats.org/drawingml/2006/picture">
             <wp:extent cx="4937760" cy="2398341"/>
-            <wp:docPr id="12" name="Picture 12"/>
+            <wp:docPr id="15" name="Picture 15"/>
             <wp:cNvGraphicFramePr>
               <a:graphicFrameLocks noChangeAspect="1"/>
             </wp:cNvGraphicFramePr>
@@ -5384,7 +5560,7 @@
                     <pic:cNvPicPr/>
                   </pic:nvPicPr>
                   <pic:blipFill>
-                    <a:blip r:embed="rId15"/>
+                    <a:blip r:embed="rId18"/>
                     <a:stretch>
                       <a:fillRect/>
                     </a:stretch>
@@ -5401,6 +5577,18 @@
             </a:graphic>
           </wp:inline>
         </w:drawing>
+      </w:r>
+    </w:p>
+    <w:p>
+      <w:pPr>
+        <w:jc w:val="center"/>
+      </w:pPr>
+      <w:r>
+        <w:rPr>
+          <w:i/>
+          <w:sz w:val="17"/>
+        </w:rPr>
+        <w:t>Figure 8: 2-Furfuraldehyde (2-FAL) and Estimated Degree of Polymerization (DP)</w:t>
       </w:r>
     </w:p>
     <w:p>
@@ -5504,7 +5692,7 @@
               <w:drawing>
                 <wp:inline xmlns:a="http://schemas.openxmlformats.org/drawingml/2006/main" xmlns:pic="http://schemas.openxmlformats.org/drawingml/2006/picture">
                   <wp:extent cx="1280160" cy="520945"/>
-                  <wp:docPr id="13" name="Picture 13"/>
+                  <wp:docPr id="16" name="Picture 16"/>
                   <wp:cNvGraphicFramePr>
                     <a:graphicFrameLocks noChangeAspect="1"/>
                   </wp:cNvGraphicFramePr>
@@ -6449,7 +6637,7 @@
           <w:color w:val="2563EB"/>
           <w:sz w:val="22"/>
         </w:rPr>
-        <w:t>6.4 Transformer Risk Matrix (PoF vs. Impact)</w:t>
+        <w:t>6.4 Transformer Risk Matrix Evaluation (CIGRE TB 761 Compliance)</w:t>
       </w:r>
     </w:p>
     <w:p>
@@ -6463,7 +6651,597 @@
           <w:color w:val="1E293B"/>
           <w:sz w:val="19"/>
         </w:rPr>
-        <w:t>With a Probability of Failure of 11.2% (Low / Green Band) and an Impact Index of 82.4% (High Importance), 34101-TR-001 plots in the Green Low-Risk Zone. The transformer poses minimal risk to system reliability while continuing in normal baseload operation.</w:t>
+        <w:t>Power transformer asset management requires establishing an objective, standardized boundary between physical condition degradation and system operational criticality. In full alignment with CIGRE Technical Brochure 761 ("Condition Assessment of Power Transformers", Working Group A2.49, Chapter 6 &amp; 7), the fleet risk evaluation implements a standardized 5×5 matrix formulation:</w:t>
+        <w:br/>
+        <w:t xml:space="preserve">    Total Risk Score = Probability of Failure (PoF) × Consequence of Failure (CoF)</w:t>
+      </w:r>
+    </w:p>
+    <w:p>
+      <w:pPr>
+        <w:spacing w:before="0" w:after="80" w:line="276" w:lineRule="auto"/>
+      </w:pPr>
+      <w:r>
+        <w:rPr>
+          <w:rFonts w:ascii="Calibri" w:hAnsi="Calibri"/>
+          <w:i w:val="0"/>
+          <w:color w:val="1E293B"/>
+          <w:sz w:val="19"/>
+        </w:rPr>
+        <w:t>Evaluation Parameters for 34101-TR-001:</w:t>
+        <w:br/>
+        <w:t xml:space="preserve"> • Probability of Failure (PoF) / Condition Index: PoF is determined by the composite Health Index (HI = 85.0%), derived from Condition Health Index (%CHI = 88.5%) and General Health Index (%GHI = 81.5%). Per CIGRE TB 761 guidelines, transformers with HI ≥ 85% correspond to PoF Category 1 (Very Low Failure Probability, annualized PoF ≈ 11.2%).</w:t>
+        <w:br/>
+        <w:t xml:space="preserve"> • Consequence of Failure (CoF) / Criticality Index: CoF reflects the overall operational, financial, safety, and network reliability consequences resulting from an unplanned forced outage. Based on the GPSC corporate asset criticality weighting (System Importance 35%, Outage Duration 25%, Financial Impact 20%, Safety &amp; Environment 20%), the unit achieves an Impact Score of 82.4%, classifying it into CoF Category 4 (Major / High Criticality).</w:t>
+        <w:br/>
+        <w:t xml:space="preserve"> • Mathematical Risk Score:</w:t>
+        <w:br/>
+        <w:t xml:space="preserve">       Risk Score = 1 (PoF) × 4 (CoF) = 4 (out of 25 possible points)</w:t>
+      </w:r>
+    </w:p>
+    <w:tbl>
+      <w:tblPr>
+        <w:tblW w:type="auto" w:w="0"/>
+        <w:jc w:val="center"/>
+        <w:tblLook w:firstColumn="1" w:firstRow="1" w:lastColumn="0" w:lastRow="0" w:noHBand="0" w:noVBand="1" w:val="04A0"/>
+        <w:tblBorders>
+          <w:top w:val="single" w:sz="4" w:space="0" w:color="CBD5E1"/>
+          <w:bottom w:val="single" w:sz="4" w:space="0" w:color="CBD5E1"/>
+          <w:insideH w:val="single" w:sz="4" w:space="0" w:color="CBD5E1"/>
+          <w:insideV w:val="single" w:sz="4" w:space="0" w:color="CBD5E1"/>
+          <w:left w:val="single" w:sz="4" w:space="0" w:color="CBD5E1"/>
+          <w:right w:val="single" w:sz="4" w:space="0" w:color="CBD5E1"/>
+        </w:tblBorders>
+      </w:tblPr>
+      <w:tblGrid>
+        <w:gridCol w:w="1950"/>
+        <w:gridCol w:w="1950"/>
+        <w:gridCol w:w="1950"/>
+        <w:gridCol w:w="1950"/>
+        <w:gridCol w:w="1950"/>
+      </w:tblGrid>
+      <w:tr>
+        <w:tc>
+          <w:tcPr>
+            <w:tcW w:type="dxa" w:w="1950"/>
+            <w:shd w:fill="1B365D"/>
+          </w:tcPr>
+          <w:p>
+            <w:r>
+              <w:rPr>
+                <w:b/>
+                <w:color w:val="FFFFFF"/>
+                <w:sz w:val="16"/>
+              </w:rPr>
+              <w:t>Risk Score</w:t>
+            </w:r>
+          </w:p>
+        </w:tc>
+        <w:tc>
+          <w:tcPr>
+            <w:tcW w:type="dxa" w:w="1950"/>
+            <w:shd w:fill="1B365D"/>
+          </w:tcPr>
+          <w:p>
+            <w:r>
+              <w:rPr>
+                <w:b/>
+                <w:color w:val="FFFFFF"/>
+                <w:sz w:val="16"/>
+              </w:rPr>
+              <w:t>Risk Category</w:t>
+            </w:r>
+          </w:p>
+        </w:tc>
+        <w:tc>
+          <w:tcPr>
+            <w:tcW w:type="dxa" w:w="1950"/>
+            <w:shd w:fill="1B365D"/>
+          </w:tcPr>
+          <w:p>
+            <w:r>
+              <w:rPr>
+                <w:b/>
+                <w:color w:val="FFFFFF"/>
+                <w:sz w:val="16"/>
+              </w:rPr>
+              <w:t>CIGRE Zone Color</w:t>
+            </w:r>
+          </w:p>
+        </w:tc>
+        <w:tc>
+          <w:tcPr>
+            <w:tcW w:type="dxa" w:w="1950"/>
+            <w:shd w:fill="1B365D"/>
+          </w:tcPr>
+          <w:p>
+            <w:r>
+              <w:rPr>
+                <w:b/>
+                <w:color w:val="FFFFFF"/>
+                <w:sz w:val="16"/>
+              </w:rPr>
+              <w:t>Standard Operational &amp; Maintenance Strategy</w:t>
+            </w:r>
+          </w:p>
+        </w:tc>
+        <w:tc>
+          <w:tcPr>
+            <w:tcW w:type="dxa" w:w="1950"/>
+            <w:shd w:fill="1B365D"/>
+          </w:tcPr>
+          <w:p>
+            <w:r>
+              <w:rPr>
+                <w:b/>
+                <w:color w:val="FFFFFF"/>
+                <w:sz w:val="16"/>
+              </w:rPr>
+              <w:t>Unit Status (34101-TR-001)</w:t>
+            </w:r>
+          </w:p>
+        </w:tc>
+      </w:tr>
+      <w:tr>
+        <w:tc>
+          <w:tcPr>
+            <w:tcW w:type="dxa" w:w="1950"/>
+            <w:shd w:fill="DCFCE7"/>
+            <w:tcMar>
+              <w:top w:w="20" w:type="dxa"/>
+              <w:bottom w:w="20" w:type="dxa"/>
+              <w:left w:w="40" w:type="dxa"/>
+              <w:right w:w="40" w:type="dxa"/>
+            </w:tcMar>
+          </w:tcPr>
+          <w:p>
+            <w:r>
+              <w:rPr>
+                <w:sz w:val="15"/>
+              </w:rPr>
+              <w:t>Score 1 – 5</w:t>
+            </w:r>
+          </w:p>
+        </w:tc>
+        <w:tc>
+          <w:tcPr>
+            <w:tcW w:type="dxa" w:w="1950"/>
+            <w:shd w:fill="DCFCE7"/>
+            <w:tcMar>
+              <w:top w:w="20" w:type="dxa"/>
+              <w:bottom w:w="20" w:type="dxa"/>
+              <w:left w:w="40" w:type="dxa"/>
+              <w:right w:w="40" w:type="dxa"/>
+            </w:tcMar>
+          </w:tcPr>
+          <w:p>
+            <w:r>
+              <w:rPr>
+                <w:sz w:val="15"/>
+              </w:rPr>
+              <w:t>Low Risk (Acceptable)</w:t>
+            </w:r>
+          </w:p>
+        </w:tc>
+        <w:tc>
+          <w:tcPr>
+            <w:tcW w:type="dxa" w:w="1950"/>
+            <w:shd w:fill="22C55E"/>
+            <w:tcMar>
+              <w:top w:w="20" w:type="dxa"/>
+              <w:bottom w:w="20" w:type="dxa"/>
+              <w:left w:w="40" w:type="dxa"/>
+              <w:right w:w="40" w:type="dxa"/>
+            </w:tcMar>
+          </w:tcPr>
+          <w:p>
+            <w:r>
+              <w:rPr>
+                <w:b/>
+                <w:color w:val="FFFFFF"/>
+                <w:sz w:val="15"/>
+              </w:rPr>
+              <w:t>Green</w:t>
+            </w:r>
+          </w:p>
+        </w:tc>
+        <w:tc>
+          <w:tcPr>
+            <w:tcW w:type="dxa" w:w="1950"/>
+            <w:shd w:fill="DCFCE7"/>
+            <w:tcMar>
+              <w:top w:w="20" w:type="dxa"/>
+              <w:bottom w:w="20" w:type="dxa"/>
+              <w:left w:w="40" w:type="dxa"/>
+              <w:right w:w="40" w:type="dxa"/>
+            </w:tcMar>
+          </w:tcPr>
+          <w:p>
+            <w:r>
+              <w:rPr>
+                <w:sz w:val="15"/>
+              </w:rPr>
+              <w:t>Routine condition-based maintenance; annual DGA/oil quality sampling; 3-year electrical diagnostic testing.</w:t>
+            </w:r>
+          </w:p>
+        </w:tc>
+        <w:tc>
+          <w:tcPr>
+            <w:tcW w:type="dxa" w:w="1950"/>
+            <w:shd w:fill="BBF7D0"/>
+            <w:tcMar>
+              <w:top w:w="20" w:type="dxa"/>
+              <w:bottom w:w="20" w:type="dxa"/>
+              <w:left w:w="40" w:type="dxa"/>
+              <w:right w:w="40" w:type="dxa"/>
+            </w:tcMar>
+          </w:tcPr>
+          <w:p>
+            <w:r>
+              <w:rPr>
+                <w:b/>
+                <w:color w:val="166534"/>
+                <w:sz w:val="15"/>
+              </w:rPr>
+              <w:t>Score = 4: ACTIVE (Normal Operation)</w:t>
+            </w:r>
+          </w:p>
+        </w:tc>
+      </w:tr>
+      <w:tr>
+        <w:tc>
+          <w:tcPr>
+            <w:tcW w:type="dxa" w:w="1950"/>
+            <w:tcMar>
+              <w:top w:w="20" w:type="dxa"/>
+              <w:bottom w:w="20" w:type="dxa"/>
+              <w:left w:w="40" w:type="dxa"/>
+              <w:right w:w="40" w:type="dxa"/>
+            </w:tcMar>
+          </w:tcPr>
+          <w:p>
+            <w:r>
+              <w:rPr>
+                <w:sz w:val="15"/>
+              </w:rPr>
+              <w:t>Score 6 – 10</w:t>
+            </w:r>
+          </w:p>
+        </w:tc>
+        <w:tc>
+          <w:tcPr>
+            <w:tcW w:type="dxa" w:w="1950"/>
+            <w:tcMar>
+              <w:top w:w="20" w:type="dxa"/>
+              <w:bottom w:w="20" w:type="dxa"/>
+              <w:left w:w="40" w:type="dxa"/>
+              <w:right w:w="40" w:type="dxa"/>
+            </w:tcMar>
+          </w:tcPr>
+          <w:p>
+            <w:r>
+              <w:rPr>
+                <w:sz w:val="15"/>
+              </w:rPr>
+              <w:t>Medium Risk (Tolerable)</w:t>
+            </w:r>
+          </w:p>
+        </w:tc>
+        <w:tc>
+          <w:tcPr>
+            <w:tcW w:type="dxa" w:w="1950"/>
+            <w:tcMar>
+              <w:top w:w="20" w:type="dxa"/>
+              <w:bottom w:w="20" w:type="dxa"/>
+              <w:left w:w="40" w:type="dxa"/>
+              <w:right w:w="40" w:type="dxa"/>
+            </w:tcMar>
+          </w:tcPr>
+          <w:p>
+            <w:r>
+              <w:rPr>
+                <w:sz w:val="15"/>
+              </w:rPr>
+              <w:t>Yellow</w:t>
+            </w:r>
+          </w:p>
+        </w:tc>
+        <w:tc>
+          <w:tcPr>
+            <w:tcW w:type="dxa" w:w="1950"/>
+            <w:tcMar>
+              <w:top w:w="20" w:type="dxa"/>
+              <w:bottom w:w="20" w:type="dxa"/>
+              <w:left w:w="40" w:type="dxa"/>
+              <w:right w:w="40" w:type="dxa"/>
+            </w:tcMar>
+          </w:tcPr>
+          <w:p>
+            <w:r>
+              <w:rPr>
+                <w:sz w:val="15"/>
+              </w:rPr>
+              <w:t>Increased surveillance; shorten DGA interval to 6 months; monitor thermal and load profile trends.</w:t>
+            </w:r>
+          </w:p>
+        </w:tc>
+        <w:tc>
+          <w:tcPr>
+            <w:tcW w:type="dxa" w:w="1950"/>
+            <w:tcMar>
+              <w:top w:w="20" w:type="dxa"/>
+              <w:bottom w:w="20" w:type="dxa"/>
+              <w:left w:w="40" w:type="dxa"/>
+              <w:right w:w="40" w:type="dxa"/>
+            </w:tcMar>
+          </w:tcPr>
+          <w:p>
+            <w:r>
+              <w:rPr>
+                <w:sz w:val="15"/>
+              </w:rPr>
+              <w:t>Not Applicable</w:t>
+            </w:r>
+          </w:p>
+        </w:tc>
+      </w:tr>
+      <w:tr>
+        <w:tc>
+          <w:tcPr>
+            <w:tcW w:type="dxa" w:w="1950"/>
+            <w:tcMar>
+              <w:top w:w="20" w:type="dxa"/>
+              <w:bottom w:w="20" w:type="dxa"/>
+              <w:left w:w="40" w:type="dxa"/>
+              <w:right w:w="40" w:type="dxa"/>
+            </w:tcMar>
+          </w:tcPr>
+          <w:p>
+            <w:r>
+              <w:rPr>
+                <w:sz w:val="15"/>
+              </w:rPr>
+              <w:t>Score 12 – 15</w:t>
+            </w:r>
+          </w:p>
+        </w:tc>
+        <w:tc>
+          <w:tcPr>
+            <w:tcW w:type="dxa" w:w="1950"/>
+            <w:tcMar>
+              <w:top w:w="20" w:type="dxa"/>
+              <w:bottom w:w="20" w:type="dxa"/>
+              <w:left w:w="40" w:type="dxa"/>
+              <w:right w:w="40" w:type="dxa"/>
+            </w:tcMar>
+          </w:tcPr>
+          <w:p>
+            <w:r>
+              <w:rPr>
+                <w:sz w:val="15"/>
+              </w:rPr>
+              <w:t>High Risk (Unfavorable)</w:t>
+            </w:r>
+          </w:p>
+        </w:tc>
+        <w:tc>
+          <w:tcPr>
+            <w:tcW w:type="dxa" w:w="1950"/>
+            <w:tcMar>
+              <w:top w:w="20" w:type="dxa"/>
+              <w:bottom w:w="20" w:type="dxa"/>
+              <w:left w:w="40" w:type="dxa"/>
+              <w:right w:w="40" w:type="dxa"/>
+            </w:tcMar>
+          </w:tcPr>
+          <w:p>
+            <w:r>
+              <w:rPr>
+                <w:sz w:val="15"/>
+              </w:rPr>
+              <w:t>Orange</w:t>
+            </w:r>
+          </w:p>
+        </w:tc>
+        <w:tc>
+          <w:tcPr>
+            <w:tcW w:type="dxa" w:w="1950"/>
+            <w:tcMar>
+              <w:top w:w="20" w:type="dxa"/>
+              <w:bottom w:w="20" w:type="dxa"/>
+              <w:left w:w="40" w:type="dxa"/>
+              <w:right w:w="40" w:type="dxa"/>
+            </w:tcMar>
+          </w:tcPr>
+          <w:p>
+            <w:r>
+              <w:rPr>
+                <w:sz w:val="15"/>
+              </w:rPr>
+              <w:t>Active preventive intervention; oil degassing/reclamation; bushing/OLTC overhaul; contingency plan.</w:t>
+            </w:r>
+          </w:p>
+        </w:tc>
+        <w:tc>
+          <w:tcPr>
+            <w:tcW w:type="dxa" w:w="1950"/>
+            <w:tcMar>
+              <w:top w:w="20" w:type="dxa"/>
+              <w:bottom w:w="20" w:type="dxa"/>
+              <w:left w:w="40" w:type="dxa"/>
+              <w:right w:w="40" w:type="dxa"/>
+            </w:tcMar>
+          </w:tcPr>
+          <w:p>
+            <w:r>
+              <w:rPr>
+                <w:sz w:val="15"/>
+              </w:rPr>
+              <w:t>Not Applicable</w:t>
+            </w:r>
+          </w:p>
+        </w:tc>
+      </w:tr>
+      <w:tr>
+        <w:tc>
+          <w:tcPr>
+            <w:tcW w:type="dxa" w:w="1950"/>
+            <w:tcMar>
+              <w:top w:w="20" w:type="dxa"/>
+              <w:bottom w:w="20" w:type="dxa"/>
+              <w:left w:w="40" w:type="dxa"/>
+              <w:right w:w="40" w:type="dxa"/>
+            </w:tcMar>
+          </w:tcPr>
+          <w:p>
+            <w:r>
+              <w:rPr>
+                <w:sz w:val="15"/>
+              </w:rPr>
+              <w:t>Score 16 – 25</w:t>
+            </w:r>
+          </w:p>
+        </w:tc>
+        <w:tc>
+          <w:tcPr>
+            <w:tcW w:type="dxa" w:w="1950"/>
+            <w:tcMar>
+              <w:top w:w="20" w:type="dxa"/>
+              <w:bottom w:w="20" w:type="dxa"/>
+              <w:left w:w="40" w:type="dxa"/>
+              <w:right w:w="40" w:type="dxa"/>
+            </w:tcMar>
+          </w:tcPr>
+          <w:p>
+            <w:r>
+              <w:rPr>
+                <w:sz w:val="15"/>
+              </w:rPr>
+              <w:t>Critical Risk (Unacceptable)</w:t>
+            </w:r>
+          </w:p>
+        </w:tc>
+        <w:tc>
+          <w:tcPr>
+            <w:tcW w:type="dxa" w:w="1950"/>
+            <w:tcMar>
+              <w:top w:w="20" w:type="dxa"/>
+              <w:bottom w:w="20" w:type="dxa"/>
+              <w:left w:w="40" w:type="dxa"/>
+              <w:right w:w="40" w:type="dxa"/>
+            </w:tcMar>
+          </w:tcPr>
+          <w:p>
+            <w:r>
+              <w:rPr>
+                <w:sz w:val="15"/>
+              </w:rPr>
+              <w:t>Red</w:t>
+            </w:r>
+          </w:p>
+        </w:tc>
+        <w:tc>
+          <w:tcPr>
+            <w:tcW w:type="dxa" w:w="1950"/>
+            <w:tcMar>
+              <w:top w:w="20" w:type="dxa"/>
+              <w:bottom w:w="20" w:type="dxa"/>
+              <w:left w:w="40" w:type="dxa"/>
+              <w:right w:w="40" w:type="dxa"/>
+            </w:tcMar>
+          </w:tcPr>
+          <w:p>
+            <w:r>
+              <w:rPr>
+                <w:sz w:val="15"/>
+              </w:rPr>
+              <w:t>Immediate engineering intervention; emergency load transfer; operational de-rating; capital replacement.</w:t>
+            </w:r>
+          </w:p>
+        </w:tc>
+        <w:tc>
+          <w:tcPr>
+            <w:tcW w:type="dxa" w:w="1950"/>
+            <w:tcMar>
+              <w:top w:w="20" w:type="dxa"/>
+              <w:bottom w:w="20" w:type="dxa"/>
+              <w:left w:w="40" w:type="dxa"/>
+              <w:right w:w="40" w:type="dxa"/>
+            </w:tcMar>
+          </w:tcPr>
+          <w:p>
+            <w:r>
+              <w:rPr>
+                <w:sz w:val="15"/>
+              </w:rPr>
+              <w:t>Not Applicable</w:t>
+            </w:r>
+          </w:p>
+        </w:tc>
+      </w:tr>
+    </w:tbl>
+    <w:p>
+      <w:pPr>
+        <w:spacing w:before="0" w:after="80" w:line="276" w:lineRule="auto"/>
+      </w:pPr>
+      <w:r>
+        <w:rPr>
+          <w:rFonts w:ascii="Calibri" w:hAnsi="Calibri"/>
+          <w:i w:val="0"/>
+          <w:color w:val="1E293B"/>
+          <w:sz w:val="19"/>
+        </w:rPr>
+        <w:t>Strategic Conclusion: Under CIGRE TB 761, 34101-TR-001 is categorized as Low Risk (Score = 4 / Green Zone). Although the transformer is strategically critical (CoF = 4), its excellent physical and dielectric condition (PoF = 1, HI = 85.0%) ensures that the probability of an unplanned outage is minimal. This confirms that the unit requires only standard routine maintenance without requiring urgent capital replacement or premature operational de-rating.</w:t>
+      </w:r>
+    </w:p>
+    <w:p>
+      <w:pPr>
+        <w:jc w:val="center"/>
+      </w:pPr>
+      <w:r>
+        <w:drawing>
+          <wp:inline xmlns:a="http://schemas.openxmlformats.org/drawingml/2006/main" xmlns:pic="http://schemas.openxmlformats.org/drawingml/2006/picture">
+            <wp:extent cx="4572000" cy="3522100"/>
+            <wp:docPr id="17" name="Picture 17"/>
+            <wp:cNvGraphicFramePr>
+              <a:graphicFrameLocks noChangeAspect="1"/>
+            </wp:cNvGraphicFramePr>
+            <a:graphic>
+              <a:graphicData uri="http://schemas.openxmlformats.org/drawingml/2006/picture">
+                <pic:pic>
+                  <pic:nvPicPr>
+                    <pic:cNvPr id="0" name="fig_risk_matrix.png"/>
+                    <pic:cNvPicPr/>
+                  </pic:nvPicPr>
+                  <pic:blipFill>
+                    <a:blip r:embed="rId13"/>
+                    <a:stretch>
+                      <a:fillRect/>
+                    </a:stretch>
+                  </pic:blipFill>
+                  <pic:spPr>
+                    <a:xfrm>
+                      <a:off x="0" y="0"/>
+                      <a:ext cx="4572000" cy="3522100"/>
+                    </a:xfrm>
+                    <a:prstGeom prst="rect"/>
+                  </pic:spPr>
+                </pic:pic>
+              </a:graphicData>
+            </a:graphic>
+          </wp:inline>
+        </w:drawing>
+      </w:r>
+    </w:p>
+    <w:p>
+      <w:pPr>
+        <w:jc w:val="center"/>
+      </w:pPr>
+      <w:r>
+        <w:rPr>
+          <w:i/>
+          <w:sz w:val="17"/>
+        </w:rPr>
+        <w:t>Figure 9: Detailed CIGRE TB 761 5×5 Risk Matrix Mapping for 34101-TR-001</w:t>
       </w:r>
     </w:p>
     <w:p>
@@ -6542,7 +7320,7 @@
               <w:drawing>
                 <wp:inline xmlns:a="http://schemas.openxmlformats.org/drawingml/2006/main" xmlns:pic="http://schemas.openxmlformats.org/drawingml/2006/picture">
                   <wp:extent cx="1280160" cy="520945"/>
-                  <wp:docPr id="14" name="Picture 14"/>
+                  <wp:docPr id="18" name="Picture 18"/>
                   <wp:cNvGraphicFramePr>
                     <a:graphicFrameLocks noChangeAspect="1"/>
                   </wp:cNvGraphicFramePr>
@@ -7471,7 +8249,7 @@
               <w:drawing>
                 <wp:inline xmlns:a="http://schemas.openxmlformats.org/drawingml/2006/main" xmlns:pic="http://schemas.openxmlformats.org/drawingml/2006/picture">
                   <wp:extent cx="1280160" cy="520945"/>
-                  <wp:docPr id="15" name="Picture 15"/>
+                  <wp:docPr id="19" name="Picture 19"/>
                   <wp:cNvGraphicFramePr>
                     <a:graphicFrameLocks noChangeAspect="1"/>
                   </wp:cNvGraphicFramePr>

</xml_diff>

<commit_message>
feat(figures): restructure Figure 1 bar chart to represent official 6 PT Components
</commit_message>
<xml_diff>
--- a/2026_Transformer_Life_Assessment_Report_34101-TR-001.docx
+++ b/2026_Transformer_Life_Assessment_Report_34101-TR-001.docx
@@ -2048,7 +2048,7 @@
       <w:r>
         <w:drawing>
           <wp:inline xmlns:a="http://schemas.openxmlformats.org/drawingml/2006/main" xmlns:pic="http://schemas.openxmlformats.org/drawingml/2006/picture">
-            <wp:extent cx="5120640" cy="2321357"/>
+            <wp:extent cx="5120640" cy="2339058"/>
             <wp:docPr id="5" name="Picture 5"/>
             <wp:cNvGraphicFramePr>
               <a:graphicFrameLocks noChangeAspect="1"/>
@@ -2069,7 +2069,7 @@
                   <pic:spPr>
                     <a:xfrm>
                       <a:off x="0" y="0"/>
-                      <a:ext cx="5120640" cy="2321357"/>
+                      <a:ext cx="5120640" cy="2339058"/>
                     </a:xfrm>
                     <a:prstGeom prst="rect"/>
                   </pic:spPr>
@@ -2089,7 +2089,7 @@
           <w:i/>
           <w:sz w:val="17"/>
         </w:rPr>
-        <w:t>Figure 1: Overall Condition Health Index Breakdown (34101-TR-001)</w:t>
+        <w:t>Figure 1: Condition Health Index Breakdown Across 6 PT Components (34101-TR-001)</w:t>
       </w:r>
     </w:p>
     <w:p>

</xml_diff>

<commit_message>
feat(remaining-life): embed CIGRE 761/SINTEF degradation chart for 34101-TR-001 into assessment report
</commit_message>
<xml_diff>
--- a/2026_Transformer_Life_Assessment_Report_34101-TR-001.docx
+++ b/2026_Transformer_Life_Assessment_Report_34101-TR-001.docx
@@ -2103,7 +2103,7 @@
           <w:color w:val="1E293B"/>
           <w:sz w:val="19"/>
         </w:rPr>
-        <w:t>Expected Remaining Lifetime: Grounded in the verified solid insulation state (DP = 1,089 and paper moisture = 0.50% wt), the Arrhenius second-order degradation kinetics project an expected remaining lifetime of 64 to 78 years before reaching the critical mechanical end-of-life threshold (DP = 300) under standard ONAN operating conditions.</w:t>
+        <w:t>Expected Remaining Lifetime: Grounded in the verified solid insulation state (DP = 1,089 from 2-FAL = 5 ppb) and actual operating environment (Moisture = 0.9% wt via SDMyers / 0.7% via DIRANA, O₂ in oil = 13,253 ppm, Hotspot = 51.1°C), the CIGRE TB 761 / SINTEF kinetic degradation model calculates a current remaining useful life of ~40.5 years before reaching the critical mechanical threshold (DP = 300, Target Year: 2066). Under standard normal conditions (dry and inert), remaining life extends up to ~77.9 years (Year 2103).</w:t>
       </w:r>
     </w:p>
     <w:p>
@@ -2113,7 +2113,7 @@
       <w:r>
         <w:drawing>
           <wp:inline xmlns:a="http://schemas.openxmlformats.org/drawingml/2006/main" xmlns:pic="http://schemas.openxmlformats.org/drawingml/2006/picture">
-            <wp:extent cx="4937760" cy="2501798"/>
+            <wp:extent cx="5029200" cy="2386429"/>
             <wp:docPr id="6" name="Picture 6"/>
             <wp:cNvGraphicFramePr>
               <a:graphicFrameLocks noChangeAspect="1"/>
@@ -2122,7 +2122,7 @@
               <a:graphicData uri="http://schemas.openxmlformats.org/drawingml/2006/picture">
                 <pic:pic>
                   <pic:nvPicPr>
-                    <pic:cNvPr id="0" name="fig_6_3_degradation.png"/>
+                    <pic:cNvPr id="0" name="fig_remaining_life_dp.png"/>
                     <pic:cNvPicPr/>
                   </pic:nvPicPr>
                   <pic:blipFill>
@@ -2134,7 +2134,7 @@
                   <pic:spPr>
                     <a:xfrm>
                       <a:off x="0" y="0"/>
-                      <a:ext cx="4937760" cy="2501798"/>
+                      <a:ext cx="5029200" cy="2386429"/>
                     </a:xfrm>
                     <a:prstGeom prst="rect"/>
                   </pic:spPr>
@@ -2154,7 +2154,7 @@
           <w:i/>
           <w:sz w:val="17"/>
         </w:rPr>
-        <w:t>Figure 2: Estimated Remaining Lifetime Degradation Curve (34101-TR-001)</w:t>
+        <w:t>Figure 2: CIGRE 761 / SINTEF Cellulose Insulation Degradation Curves (34101-TR-001)</w:t>
       </w:r>
     </w:p>
     <w:p>
@@ -7270,11 +7270,62 @@
           <w:color w:val="1E293B"/>
           <w:sz w:val="19"/>
         </w:rPr>
-        <w:t>Cellulose solid insulation degradation is modeled using the verified starting condition (DP = 1,089 from 2-FAL = 5 ppb and moisture = 0.50% wt via DIRANA). Modeling follows the second-order chain scission kinetic rate:</w:t>
+        <w:t>Cellulose solid insulation degradation is modeled using the verified starting condition (DP = 1,089 from 2-FAL = 5 ppb via Dominelli correlation and paper moisture = 0.70% wt via DIRANA FDS / 0.90% wt via SDMyers moisture equilibrium). Modeling follows the second-order chain scission kinetic rate per CIGRE TB 761 and SINTEF thermal-chemical model:</w:t>
         <w:br/>
         <w:t xml:space="preserve">    (1 / DP_end) - (1 / DP_start) = k * t</w:t>
         <w:br/>
-        <w:t>Hot-spot temperature calculated per IEC 60076-7 is θh = 55.1°C (average operating winding temperature 40°C + 15.1°C hotspot gradient under ONAN cooling). Under conservative Arrhenius dry kinetics (k = 1.50 x 10^-5 year^-1), the time required for cellulose to reach the critical mechanical threshold (DP = 300) is 161 years (&gt; Year 2100). Even under worst-case degradation scenarios (moisture &gt; 2.0% wt, continuous oxygen ingress), remaining life exceeds 53 years.</w:t>
+        <w:t>Hot-spot temperature calculated per IEC 60076-7 is θh = 51.1°C (oil temperature 46.0°C + 5.1°C hotspot rise). Accounting for dissolved oxygen ingress (O₂ = 13,253 ppm in oil, classifying under SINTEF High O₂ regime ≥ 7,000 ppm), the kinetic aging rate is evaluated at k = 5.97 × 10^-5 year^-1. The time required for cellulose to reach the critical mechanical threshold (DP = 300) is evaluated at ~40.5 years (Target Year: 2066), while the ultimate paper embrittlement boundary (DP = 200) will be reached after ~68.4 years (Year 2093). Under standard normal operating conditions (moisture 0.5–2.0%, O₂ &lt; 7,000 ppm, k = 3.10 × 10^-5 year^-1), the expected remaining life is ~77.9 years (Year 2103).</w:t>
+      </w:r>
+    </w:p>
+    <w:p>
+      <w:pPr>
+        <w:jc w:val="center"/>
+      </w:pPr>
+      <w:r>
+        <w:drawing>
+          <wp:inline xmlns:a="http://schemas.openxmlformats.org/drawingml/2006/main" xmlns:pic="http://schemas.openxmlformats.org/drawingml/2006/picture">
+            <wp:extent cx="5029200" cy="4833891"/>
+            <wp:docPr id="18" name="Picture 18"/>
+            <wp:cNvGraphicFramePr>
+              <a:graphicFrameLocks noChangeAspect="1"/>
+            </wp:cNvGraphicFramePr>
+            <a:graphic>
+              <a:graphicData uri="http://schemas.openxmlformats.org/drawingml/2006/picture">
+                <pic:pic>
+                  <pic:nvPicPr>
+                    <pic:cNvPr id="0" name="fig_remaining_life_combined.png"/>
+                    <pic:cNvPicPr/>
+                  </pic:nvPicPr>
+                  <pic:blipFill>
+                    <a:blip r:embed="rId19"/>
+                    <a:stretch>
+                      <a:fillRect/>
+                    </a:stretch>
+                  </pic:blipFill>
+                  <pic:spPr>
+                    <a:xfrm>
+                      <a:off x="0" y="0"/>
+                      <a:ext cx="5029200" cy="4833891"/>
+                    </a:xfrm>
+                    <a:prstGeom prst="rect"/>
+                  </pic:spPr>
+                </pic:pic>
+              </a:graphicData>
+            </a:graphic>
+          </wp:inline>
+        </w:drawing>
+      </w:r>
+    </w:p>
+    <w:p>
+      <w:pPr>
+        <w:jc w:val="center"/>
+      </w:pPr>
+      <w:r>
+        <w:rPr>
+          <w:i/>
+          <w:sz w:val="17"/>
+        </w:rPr>
+        <w:t>Figure 10: CIGRE TB 761 / SINTEF Cellulose Degradation Curves and Weibull PoF Projection (34101-TR-001)</w:t>
       </w:r>
     </w:p>
     <w:p>
@@ -7320,7 +7371,7 @@
               <w:drawing>
                 <wp:inline xmlns:a="http://schemas.openxmlformats.org/drawingml/2006/main" xmlns:pic="http://schemas.openxmlformats.org/drawingml/2006/picture">
                   <wp:extent cx="1280160" cy="520945"/>
-                  <wp:docPr id="18" name="Picture 18"/>
+                  <wp:docPr id="19" name="Picture 19"/>
                   <wp:cNvGraphicFramePr>
                     <a:graphicFrameLocks noChangeAspect="1"/>
                   </wp:cNvGraphicFramePr>
@@ -8249,7 +8300,7 @@
               <w:drawing>
                 <wp:inline xmlns:a="http://schemas.openxmlformats.org/drawingml/2006/main" xmlns:pic="http://schemas.openxmlformats.org/drawingml/2006/picture">
                   <wp:extent cx="1280160" cy="520945"/>
-                  <wp:docPr id="19" name="Picture 19"/>
+                  <wp:docPr id="20" name="Picture 20"/>
                   <wp:cNvGraphicFramePr>
                     <a:graphicFrameLocks noChangeAspect="1"/>
                   </wp:cNvGraphicFramePr>

</xml_diff>